<commit_message>
Refine coursework wording and metadata; stage lab revision
</commit_message>
<xml_diff>
--- a/submissions/initial-phases/A_Aspiration/ClassMic_A2_Aspiration.docx
+++ b/submissions/initial-phases/A_Aspiration/ClassMic_A2_Aspiration.docx
@@ -15,7 +15,7 @@
         <w:pStyle w:val="Subtitle"/>
       </w:pPr>
       <w:r>
-        <w:t>A2   Revised project opportunity</w:t>
+        <w:t>A2   Project opportunity</w:t>
       </w:r>
     </w:p>
     <w:p>
@@ -28,7 +28,7 @@
     </w:p>
     <w:p>
       <w:r>
-        <w:t>Our aim is to make student contributions easier for the whole classroom to hear while the instructor keeps control of the discussion. We propose a small ClassMic prototype to test whether phones can support that aim through the room speakers.</w:t>
+        <w:t>ClassMic would let an instructor approve a student’s phone as a classroom microphone. We will build a small browser prototype and test whether it makes questions easier to hear without slowing the discussion.</w:t>
       </w:r>
     </w:p>
     <w:p>
@@ -41,12 +41,12 @@
     </w:p>
     <w:p>
       <w:r>
-        <w:t>A question from one student can help the whole class only if others hear it. When a voice does not carry across the room, the instructor may need to repeat the question or wait while a microphone reaches the student. Those workarounds can interrupt discussion. The size and frequency of this problem in our classes still need to be measured.</w:t>
+        <w:t>A question from one student can help the whole class only if others hear it. When a voice does not carry across the room, the instructor may need to repeat the question or wait while a microphone reaches the student. We have not yet measured how often this happens in our classes.</w:t>
       </w:r>
     </w:p>
     <w:p>
       <w:r>
-        <w:t>ClassMic addresses the CONNECT theme through shared learning and direct classroom participation. The opportunity is to improve how people hear and respond to one another during an existing class.</w:t>
+        <w:t>The project supports the CONNECT theme by helping students hear and respond to one another during class.</w:t>
       </w:r>
     </w:p>
     <w:p>
@@ -59,12 +59,12 @@
     </w:p>
     <w:p>
       <w:r>
-        <w:t>The proposed concept uses an instructor-controlled phone microphone using existing Wi-Fi and speakers, with one active speaker, low delay and 75% positive feedback. Local demand and technical performance still need evaluation.</w:t>
+        <w:t>The prototype will use existing Wi-Fi and speakers, with only one phone transmitting at a time. We will test audio delay and ask volunteer reviewers whether it improves audibility.</w:t>
       </w:r>
     </w:p>
     <w:p>
       <w:r>
-        <w:t>A commercial example, Biamp Crowd Mics, already supports phone microphones and moderator control [1]. This makes it a useful alternative to investigate. ClassMic must demonstrate the value of its proposed browser workflow before the team recommends a larger investment.</w:t>
+        <w:t>Biamp Crowd Mics already offers phone microphones and moderator controls [1]. It provides a commercial alternative to consider alongside the prototype and current classroom practice.</w:t>
       </w:r>
     </w:p>
     <w:p>
@@ -77,7 +77,7 @@
     </w:p>
     <w:p>
       <w:r>
-        <w:t>For students and instructors who find peer contributions hard to hear, ClassMic would provide a temporary speaking channel from a student phone to a room speaker. Students request a turn. The instructor approves the speaker and can stop the audio. The prototype will test whether this process is easier than the current classroom workaround.</w:t>
+        <w:t>Students would join a temporary session, request a turn and speak through the room speakers after instructor approval. The instructor could mute the microphone or end the session. The intended benefit is clearer questions with less time spent passing a microphone.</w:t>
       </w:r>
     </w:p>
     <w:p>
@@ -90,7 +90,7 @@
     </w:p>
     <w:p>
       <w:r>
-        <w:t>The course project covers requirements, a focused prototype, controlled tests and a recommendation. Development uses two weekly sprints. A live classroom rollout, paid infrastructure and a six-week institutional pilot require a later decision.</w:t>
+        <w:t>The course project covers requirements, a small prototype, controlled tests and a recommendation. Development will use two weekly sprints. A classroom rollout, paid infrastructure or a longer institutional pilot would require a separate decision.</w:t>
       </w:r>
     </w:p>
     <w:p>
@@ -357,7 +357,7 @@
                 <w:color w:val="000000"/>
                 <w:sz w:val="21"/>
               </w:rPr>
-              <w:t>Temiko leads the prototype. Nurtore coordinates requirements and delivery. These responsibilities form the proposed staffing plan.</w:t>
+              <w:t>Proposed roles: Temiko leads development and testing. Nurtore coordinates requirements and delivery.</w:t>
             </w:r>
           </w:p>
         </w:tc>
@@ -416,7 +416,7 @@
                 <w:color w:val="000000"/>
                 <w:sz w:val="21"/>
               </w:rPr>
-              <w:t>Review the revised idea, charter and course deliverables. The instructor reviews the course proposal.</w:t>
+              <w:t>Review the project scope and assess course deliverables.</w:t>
             </w:r>
           </w:p>
         </w:tc>
@@ -475,7 +475,7 @@
                 <w:color w:val="000000"/>
                 <w:sz w:val="21"/>
               </w:rPr>
-              <w:t>Review device, network, sound and access issues if a real room test becomes available. Participation is unconfirmed.</w:t>
+              <w:t>Advise on device compatibility, room sound and accessibility if a room test can be arranged.</w:t>
             </w:r>
           </w:p>
         </w:tc>
@@ -496,7 +496,7 @@
     </w:p>
     <w:p>
       <w:r>
-        <w:t>Proposed evaluation targets include a 95th percentile one-way audio delay of no more than 150 milliseconds, alongside the measures below.</w:t>
+        <w:t>The one-way audio-delay target is a 95th percentile of 150 milliseconds or less. The remaining targets are listed below.</w:t>
       </w:r>
     </w:p>
     <w:tbl>
@@ -605,7 +605,7 @@
                 <w:color w:val="000000"/>
                 <w:sz w:val="21"/>
               </w:rPr>
-              <w:t>Working scope</w:t>
+              <w:t>Prototype scope</w:t>
             </w:r>
           </w:p>
         </w:tc>
@@ -632,7 +632,7 @@
                 <w:color w:val="000000"/>
                 <w:sz w:val="21"/>
               </w:rPr>
-              <w:t>Complete five priority user stories and all Must acceptance checks.</w:t>
+              <w:t>Complete five priority user stories and pass all required acceptance checks.</w:t>
             </w:r>
           </w:p>
         </w:tc>
@@ -750,7 +750,7 @@
                 <w:color w:val="000000"/>
                 <w:sz w:val="21"/>
               </w:rPr>
-              <w:t>At least 75% positive feedback from at least 5 volunteer reviewers. Report the actual numerator and denominator.</w:t>
+              <w:t>At least 75% positive feedback from at least 5 volunteer reviewers. Include the response counts.</w:t>
             </w:r>
           </w:p>
         </w:tc>
@@ -830,7 +830,7 @@
     </w:p>
     <w:p>
       <w:r>
-        <w:t>ClassMic is a classroom microphone concept that lets students request a turn from their phones and speak through the room speakers after instructor approval. We want to test whether it makes student questions easier to hear without adding classroom friction. Our course project will build and evaluate a small prototype in two weekly sprints, then recommend whether a larger pilot is worthwhile.</w:t>
+        <w:t>ClassMic lets students request a speaking turn from their phones. After instructor approval, their voice plays through the room speakers. We want to test whether this makes questions easier to hear without slowing the discussion. In two weekly sprints, we will build a small prototype, test it with volunteers and decide whether a larger pilot is worth pursuing.</w:t>
       </w:r>
     </w:p>
     <w:p>

</xml_diff>